<commit_message>
Freeze final research delivery and independent Word acceptance verdict
</commit_message>
<xml_diff>
--- a/research/sgrt_word_completion_20261021/delivery/SGRT_RESEARCH_REPORT_20261021.docx
+++ b/research/sgrt_word_completion_20261021/delivery/SGRT_RESEARCH_REPORT_20261021.docx
@@ -614,7 +614,7 @@
     </w:p>
     <w:p>
       <w:r>
-        <w:t>Дополнительно восстановлены 20 559 экспериментальных интервалов российского бонитета по атласной карте масштаба 1:30,000,000. Интервалы выделены только при устойчивом классе в пределах ошибки геопривязки; контрольная RMSE около 19.3 км. Смешанные классы и экстраполяция вне опорных точек оставлены неизвестными. Это отдельная чувствительность, а не точечная кадастровая оценка и не замена FAO-рейтинга в основной спецификации.</w:t>
+        <w:t>Дополнительно восстановлены 20 559 экспериментальных интервалов российского бонитета по атласной карте масштаба 1:30,000,000. Интервалы выделены только при устойчивом классе в пределах ошибки геопривязки; техническая неслепая проверка контрольных точек дала RMSE около 19.3 км. Это не независимая оценка точности геопривязки. Смешанные классы и экстраполяция вне опорных точек оставлены неизвестными. Это отдельная чувствительность, а не точечная кадастровая оценка и не замена FAO-рейтинга в основной спецификации.</w:t>
       </w:r>
     </w:p>
     <w:p>
@@ -637,7 +637,7 @@
     </w:p>
     <w:p>
       <w:r>
-        <w:t>Центральность варианта WordCi задана формулой Ci=0,5·minmax(log Mi)+0,5·minmax(log(1+R2021)), где R2021 — предварительная сельская людность. Для основного Ci предварительная сельская людность берётся по наблюдаемому перечню переписи 2021. Исторические записи, не входящие в этот перечень, исключены только из данного R2021 и не превращены в нули; они сохранены в полной источниковой оси и отдельных агрегатах. Чувствительность к строгой полноте по всем источниковым единицам рассчитывается отдельным вариантом. Ранги варианта WordCi учитывают собственную массу Mi и объём предварительного сельского окружения в явной формуле центральности Ci. Сначала выполняется один предварительный выбор среди всех центров; известный сельский объём и UNKNOWN сохраняются отдельно. Затем рассчитываются Ci и монотонные ранги, после чего строится окончательная иерархия снизу вверх. Собственная Mi на притянутом населении не переобучается и остаётся гравитационным весом. Для родительской связи WordCi требуются больший Ci и старший монотонный порядок; меньшая собственная Mi у такого родителя допустима, поскольку в Ci включено предварительное сельское окружение. Предварительный и окончательный составы не смешиваются; исходный вариант рангов по собственной массе остаётся сравнительным сценарием. Статистические границы рангов определяются пересечениями взвешенной GMM и не объявляются наблюдаемыми ступенями обслуживания. Поскольку людность 2021 участвует в Mi и Ci, геометрия районов и ретроспективный демографический исход статистически связаны конструкцией; это дополнительное основание описательной, а не причинной интерпретации. В предварительном реестре: 155 411 единиц наблюдаемого перечня переписи 2021, включая 24 758 наблюдаемых нулей; неизвестных значений в этом перечне — 0. Компонента наблюдаемого перечня полна у 3 897 центров. Для сравнения, требование полноты по всем историческим источниковым единицам выполняется у 3 729 центров; неполнота затрагивает 168 центров и 528 единиц в предварительно назначенных окружениях.</w:t>
+        <w:t>Центральность варианта WordCi задана формулой Ci=0,5·minmax(log Mi)+0,5·minmax(log(1+R2021)), где R2021 — предварительная сельская людность. Для основного Ci предварительная сельская людность берётся по наблюдаемому перечню переписи 2021. Исторические записи, не входящие в этот перечень, исключены только из данного R2021 и не превращены в нули; они сохранены в полной источниковой оси и отдельных агрегатах. Строгая полнота по всем историческим источниковым единицам сохранена только в диагностических колонках; полного альтернативного расчёта иерархии по такому Ci не выполнялось. Ранги варианта WordCi учитывают собственную массу Mi и объём предварительного сельского окружения в явной формуле центральности Ci. Сначала выполняется один предварительный выбор среди всех центров; известный сельский объём и UNKNOWN сохраняются отдельно. Затем рассчитываются Ci и монотонные ранги, после чего строится окончательная иерархия снизу вверх. Собственная Mi на притянутом населении не переобучается и остаётся гравитационным весом. Для родительской связи WordCi требуются больший Ci и старший монотонный порядок; меньшая собственная Mi у такого родителя допустима, поскольку в Ci включено предварительное сельское окружение. Предварительный и окончательный составы не смешиваются; исходный вариант рангов по собственной массе остаётся сравнительным сценарием. Статистические границы рангов берутся в точке пересечения взвешенных плотностей соседних компонент GMM между их средними; если пересечения нет, применяется явно заданная середина между средними. Они не объявляются наблюдаемыми ступенями обслуживания. Поскольку людность 2021 участвует в Mi и Ci, геометрия районов и ретроспективный демографический исход статистически связаны конструкцией; это дополнительное основание описательной, а не причинной интерпретации. В выбранном расчёте правило середины применено для 1 из 3 границ; остальные используют пересечение плотностей. В предварительном реестре: 155 411 единиц наблюдаемого перечня переписи 2021, включая 24 758 наблюдаемых нулей; неизвестных значений в этом перечне — 0. Компонента наблюдаемого перечня полна у 3 897 центров. В диагностических колонках требование полноты по всем историческим источниковым единицам выполняется у 3 729 центров; неполнота затрагивает 168 центров и 528 единиц в предварительно назначенных окружениях.</w:t>
       </w:r>
     </w:p>
     <w:p>
@@ -924,7 +924,7 @@
     </w:p>
     <w:p>
       <w:r>
-        <w:t>Для каждого уровня сохранены известные суммы, число неизвестных значений, реальные нули, собственное население центра и население внешнего сельского окружения. Полным темпом района называется только изменение сопоставимой полной пары. Изменение состава территории и ошибка исторических связок остаются самостоятельным источником неопределённости.</w:t>
+        <w:t>Для каждого уровня сохранены известные суммы, число неизвестных значений, реальные нули, собственное население центра и население внешнего сельского окружения. Изменение рассчитывается для численно полной пары наблюдений; полнота чисел сама по себе не доказывает историческую сопоставимость границ. Изменение состава территории и ошибка исторических связок остаются самостоятельным источником неопределённости.</w:t>
       </w:r>
     </w:p>
     <w:p>
@@ -2949,7 +2949,7 @@
     </w:p>
     <w:p>
       <w:r>
-        <w:t>Примеры выбираются из фактически рассчитанных положительных описательных типов каждого уровня, до трёх на сочетание. Темпы — среднегодовые изменения центра и сельского окружения; население системы показано известной суммой и читается вместе с флагами полноты. Таблица не устанавливает причин наблюдаемой динамики.</w:t>
+        <w:t>Примеры выбираются из фактически рассчитанных положительных описательных типов каждого уровня, до трёх на сочетание. Темпы — среднегодовые изменения центра и сельского окружения; население всей СГРТ (центр и всё включённое окружение), а не только центра, показано известной суммой и читается вместе с флагами полноты. Таблица не устанавливает причин наблюдаемой динамики.</w:t>
       </w:r>
     </w:p>
     <w:tbl>
@@ -3023,7 +3023,7 @@
           </w:tcPr>
           <w:p>
             <w:r>
-              <w:t>P2010 → P2021</w:t>
+              <w:t>Население всей СГРТ:2010 → 2021</w:t>
             </w:r>
           </w:p>
         </w:tc>

</xml_diff>